<commit_message>
Embed photos in DOCX, preload only latest, drop autocomplete lookups
* Photos: render context now creates docxtpl.InlineImage entries from
  audit.photos and the master template gained a section 16 'FOTOD'
  loop. Verified end-to-end — 2 uploads → 2 inline drawings in word/media/.
  Photos sort by section_ref so 8.x cluster together.

* Preload limited to a single latest report (default limit=1). Filename
  trailing date drives the sort — the freshest .docx wins. Earlier batch
  imports produced messy text-dump findings; this keeps the demo clean.
  Pass limit=0 to import all.

* Per user request, autocomplete lookups disabled on pages 1 & 2 — back
  to plain st.text_input. The combobox helper + db.lookups module remain
  in the codebase for later but are not wired in.

22 tests still pass.

Co-Authored-By: Claude Opus 4.7 (1M context) <noreply@anthropic.com>
</commit_message>
<xml_diff>
--- a/src/tadf/templates/ea_erakorraline.docx
+++ b/src/tadf/templates/ea_erakorraline.docx
@@ -622,6 +622,41 @@
         <w:rPr>
           <w:sz w:val="28"/>
         </w:rPr>
+        <w:t>16. FOTOD</w:t>
+      </w:r>
+    </w:p>
+    <w:p>
+      <w:r>
+        <w:t>{% for photo in photos %}</w:t>
+      </w:r>
+    </w:p>
+    <w:p>
+      <w:r>
+        <w:rPr>
+          <w:b w:val="0"/>
+          <w:sz w:val="22"/>
+        </w:rPr>
+        <w:t>[{{ photo.section_ref }}]  {{ photo.caption }}</w:t>
+      </w:r>
+    </w:p>
+    <w:p>
+      <w:r>
+        <w:t>{{ photo.image }}</w:t>
+      </w:r>
+    </w:p>
+    <w:p>
+      <w:r>
+        <w:t>{% endfor %}</w:t>
+      </w:r>
+    </w:p>
+    <w:p>
+      <w:pPr>
+        <w:pStyle w:val="Heading1"/>
+      </w:pPr>
+      <w:r>
+        <w:rPr>
+          <w:sz w:val="28"/>
+        </w:rPr>
         <w:t>15. ALLKIRJAD</w:t>
       </w:r>
     </w:p>

</xml_diff>